<commit_message>
docs: add raw Docker logs, postgres dump, latency benchmark, and updated manuscript
</commit_message>
<xml_diff>
--- a/docs/DeceptionNet_Submission_Manuscript.docx
+++ b/docs/DeceptionNet_Submission_Manuscript.docx
@@ -43,7 +43,9 @@
         <w:br/>
         <w:t>[NEED FROM AUTHOR: Author email addresses]</w:t>
         <w:br/>
-        <w:t>Repository: https://github.com/Pi25sh/DeceptionNet (Pinned SHA: 153c58d6b3460c7fd043651d3e302929ee463002)</w:t>
+        <w:t>[NEED FROM AUTHOR: Target venue and template specification]</w:t>
+        <w:br/>
+        <w:t>Repository: https://github.com/Pi25sh/DeceptionNet</w:t>
       </w:r>
     </w:p>
     <w:tbl>
@@ -184,7 +186,7 @@
         <w:t xml:space="preserve">• Deterministic MITRE Attribution &amp; Scoring: </w:t>
       </w:r>
       <w:r>
-        <w:t>We define a rule engine containing 34 specifications (16 command keyword rules spanning 50 signatures and 18 event-type normalization rules) mapping decoy interactions to 22 distinct MITRE ATT&amp;CK techniques with monotonic additive severity scoring.</w:t>
+        <w:t>We define a rule engine containing 34 specifications (16 command keyword rules spanning 49 signatures and 18 event-type normalization rules) mapping decoy interactions to 22 distinct MITRE ATT&amp;CK techniques with monotonic additive severity scoring.</w:t>
         <w:br/>
       </w:r>
       <w:r>
@@ -363,7 +365,7 @@
         <w:br/>
       </w:r>
       <w:r>
-        <w:t>A responsive single-page web interface built with React 18 and Vite, streaming live incident feeds over WebSockets and rendering session timelines, ATT&amp;CK distributions, and PDF incident reports.</w:t>
+        <w:t>A responsive single-page web interface built with React 18, Vite 5, Recharts, and Vanilla CSS, streaming live incident feeds over WebSockets and rendering session timelines, ATT&amp;CK distributions, and PDF incident reports.</w:t>
       </w:r>
     </w:p>
     <w:p>
@@ -381,7 +383,7 @@
     </w:p>
     <w:p>
       <w:r>
-        <w:t>To ensure predictable attribution latency (&lt; 1 ms per event) and eliminate non-deterministic hallucinations during active attacks, core-api/mitre.py evaluates incoming telemetry against a deterministic two-tier rule hierarchy:</w:t>
+        <w:t>To ensure predictable attribution latency and eliminate non-deterministic hallucinations during active attacks, core-api/mitre.py evaluates incoming telemetry against a deterministic two-tier rule hierarchy:</w:t>
       </w:r>
     </w:p>
     <w:p>
@@ -389,7 +391,7 @@
         <w:rPr>
           <w:b/>
         </w:rPr>
-        <w:t xml:space="preserve">• Command Keyword Rules (16 rules, 50 keywords): </w:t>
+        <w:t xml:space="preserve">• Command Keyword Rules (16 rules, 49 signatures): </w:t>
       </w:r>
       <w:r>
         <w:t>Evaluates shell commands using regex word-boundary matching (\b) to avoid sub-token false positives (e.g., ensuring 'id' matches user discovery without falsely triggering on 'rapid'). Specific rules take precedence over general ones: reading '/etc/passwd' or '/etc/shadow' maps to T1003.008 (weight 5.0) before generic password manipulation maps to T1098 (weight 3.0). System enumeration commands are strictly differentiated: 'whoami' and 'id' map to T1033 (weight 1.0), whereas 'uname' maps to T1082 (weight 1.0).</w:t>
@@ -415,16 +417,12 @@
           <w:color w:val="2E5B88"/>
           <w:sz w:val="23"/>
         </w:rPr>
-        <w:t>4.2 Monotonic Additive Severity Scoring</w:t>
+        <w:t>4.2 Empirical Rule Evaluation Latency</w:t>
       </w:r>
     </w:p>
     <w:p>
       <w:r>
-        <w:t>Session threat severity is computed as an incremental additive function over positively identified technique weights:</w:t>
-        <w:br/>
-        <w:t xml:space="preserve">   Severity_new = round(Severity_current + w_i, 2)  for w_i &gt; 0</w:t>
-        <w:br/>
-        <w:t>Unmapped commands or background noise contribute weight 0.0, leaving the cumulative score unchanged. As defined in the operator dashboard, severity scores map into four operational tiers: Low (&lt; 1.0), Elevated (1.0–2.4), High (2.5–3.9), and Critical (≥ 4.0). Because the severity score is monotonically non-decreasing, once an attacker executes an exploitation step, the session permanently retains its elevated triage priority.</w:t>
+        <w:t>To establish empirical verification for rule engine performance, an automated benchmark script (scripts/benchmark_rule_latency.py) executed 140,000 evaluations (10,000 iterations across a 14-item corpus of attack payloads, event types, and noise commands) using high-resolution hardware performance counters (time.perf_counter_ns). The rule engine achieved a mean evaluation latency of 10.56 µs (0.011 ms), a median of 2.50 µs, a 95th percentile of 34.10 µs, and a 99th percentile of 58.10 µs (0.058 ms). The raw statistical distribution is committed under results/rule_latency_benchmark.json.</w:t>
       </w:r>
     </w:p>
     <w:p>
@@ -437,7 +435,29 @@
           <w:color w:val="2E5B88"/>
           <w:sz w:val="23"/>
         </w:rPr>
-        <w:t>4.3 Sliding-Window Session Correlation</w:t>
+        <w:t>4.3 Monotonic Additive Severity Scoring</w:t>
+      </w:r>
+    </w:p>
+    <w:p>
+      <w:r>
+        <w:t>Session threat severity is computed as an incremental additive function over positively identified technique weights:</w:t>
+        <w:br/>
+        <w:t xml:space="preserve">   Severity_new = round(Severity_current + w_i, 2)  for w_i &gt; 0</w:t>
+        <w:br/>
+        <w:t>Unmapped commands or background noise contribute weight 0.0, leaving the cumulative score unchanged. As defined in dashboard/src/utils.js, severity scores map into four operational tiers: Low (&lt; 1.0), Elevated (1.0–2.4), High (2.5–3.9), and Critical (≥ 4.0). Because the severity score is monotonically non-decreasing, once an attacker executes an exploitation step, the session permanently retains its elevated triage priority.</w:t>
+      </w:r>
+    </w:p>
+    <w:p>
+      <w:pPr>
+        <w:spacing w:before="200" w:after="60"/>
+      </w:pPr>
+      <w:r>
+        <w:rPr>
+          <w:b/>
+          <w:color w:val="2E5B88"/>
+          <w:sz w:val="23"/>
+        </w:rPr>
+        <w:t>4.4 Sliding-Window Session Correlation</w:t>
       </w:r>
     </w:p>
     <w:p>
@@ -459,7 +479,7 @@
           <w:color w:val="2E5B88"/>
           <w:sz w:val="23"/>
         </w:rPr>
-        <w:t>4.4 Decoupled AI Threat Intelligence &amp; Reporting</w:t>
+        <w:t>4.5 Decoupled AI Threat Intelligence &amp; Reporting</w:t>
       </w:r>
     </w:p>
     <w:p>
@@ -493,7 +513,7 @@
         <w:t xml:space="preserve">• Core API: </w:t>
       </w:r>
       <w:r>
-        <w:t>FastAPI 0.115+, SQLAlchemy 2.0+ ORM, PostgreSQL 16 (production) or SQLite (testing), Uvicorn ASGI server.</w:t>
+        <w:t>FastAPI 0.109.2 (pinned in core-api/requirements.txt), SQLAlchemy 2.0.25 ORM, PostgreSQL 16 (Compose) or SQLite (testing), Uvicorn 0.27.1 ASGI server.</w:t>
         <w:br/>
       </w:r>
       <w:r>
@@ -523,7 +543,7 @@
         <w:t xml:space="preserve">• Operator Dashboard: </w:t>
       </w:r>
       <w:r>
-        <w:t>React 18.2, Vite 5, Tailwind CSS, Native WebSocket API.</w:t>
+        <w:t>React 18.2.0, Vite 5.1.0, Lucide-React 0.330.0, Recharts 2.15.4, Vanilla CSS (dashboard/package.json).</w:t>
         <w:br/>
       </w:r>
       <w:r>
@@ -961,7 +981,7 @@
     </w:p>
     <w:p>
       <w:r>
-        <w:t>Provenance: The case study results presented herein were produced via a REAL_RUN execution of the automated multi-stage attack harness (attacker/scripts/full-attack.sh) inside the running Docker Compose environment. Real network traffic was transmitted from the attacker container (172.21.0.5) across honeypot_net to the attack-target container (port 9090). Interaction logs were written to a shared volume, tailed in real time by log-forwarder-target, shipped over HTTP across the deceptionnet bridge network to core-api (port 8000), and committed into PostgreSQL. The complete database export is committed under results/case_study_raw.json and results/case_study.db.</w:t>
+        <w:t>Provenance: The case study results presented herein were produced via a REAL_RUN execution of the automated multi-stage attack harness (attacker/scripts/full-attack.sh) inside the running Docker Compose environment. Real network traffic was transmitted from the attacker container (172.21.0.5) across honeypot_net to the attack-target container (port 9090). Interaction logs were written to a shared volume, tailed in real time by log-forwarder-target, shipped over HTTP across the deceptionnet bridge network to core-api (port 8000), and committed into PostgreSQL. The raw evidence artifacts—including the full container log stream (results/docker_compose_logs.txt), raw PostgreSQL database dump (results/postgres_dump.sql), SQLite export (results/case_study.db), and normalized JSON export (results/case_study_raw.json)—are committed directly to the repository.</w:t>
       </w:r>
     </w:p>
     <w:p>
@@ -2438,7 +2458,7 @@
     </w:p>
     <w:p>
       <w:r>
-        <w:t>DeceptionNet demonstrates an open-source, reproducible architecture for active cyber defense that harmonizes multi-honeypot orchestration, deterministic ATT&amp;CK mapping, and decoupled generative threat summarization. By strictly excluding LLMs from the live execution loop, DeceptionNet eliminates prompt injection risks and interactive hallucinations while preserving deterministic attribution speed (&lt; 1 ms). The platform's internal consistency is validated by an 84-test automated pytest suite, and its operational flow is demonstrated through a verified live Docker harness run capturing 14 events across 6 sessions (cumulative campaign severity: 26.0).</w:t>
+        <w:t>DeceptionNet demonstrates an open-source, reproducible architecture for active cyber defense that harmonizes multi-honeypot orchestration, deterministic ATT&amp;CK mapping, and decoupled generative threat summarization. By strictly excluding LLMs from the live execution loop, DeceptionNet eliminates prompt injection risks and interactive hallucinations while preserving deterministic attribution speed (mean 0.011 ms). The platform's internal consistency is validated by an 84-test automated pytest suite, and its operational flow is demonstrated through a verified live Docker harness run capturing 14 events across 6 sessions (cumulative campaign severity: 26.0).</w:t>
       </w:r>
     </w:p>
     <w:p>
@@ -2497,7 +2517,7 @@
         <w:t xml:space="preserve">• Data and Code Availability: </w:t>
       </w:r>
       <w:r>
-        <w:t>All source code, Docker configurations, test suites, and raw case-study outputs are publicly available in the GitHub repository: https://github.com/Pi25sh/DeceptionNet, pinned at commit SHA 153c58d6b3460c7fd043651d3e302929ee463002.</w:t>
+        <w:t>All source code, Docker configurations, test suites, raw database dumps, and container execution logs are publicly available in the GitHub repository: https://github.com/Pi25sh/DeceptionNet.</w:t>
       </w:r>
     </w:p>
     <w:p>
@@ -2654,7 +2674,7 @@
         <w:rPr>
           <w:sz w:val="19"/>
         </w:rPr>
-        <w:t>[12] F. Cohen, "Operating system protection through program evolution," Computers &amp; Security, vol. 12, no. 6, pp. 565–584, Oct. 1993. doi: 10.1016/0167-4048(93)90054-9.</w:t>
+        <w:t>[12] F. Cohen, "A note on the role of deception in information protection," Computers &amp; Security, vol. 17, no. 6, pp. 483–506, 1998. doi: 10.1016/S0167-4048(98)80058-3.</w:t>
       </w:r>
     </w:p>
     <w:p>
@@ -2666,7 +2686,7 @@
         <w:rPr>
           <w:sz w:val="19"/>
         </w:rPr>
-        <w:t>[13] F. Cohen, "The use of deception in information protection," Computers &amp; Security, vol. 19, no. 5, pp. 455–464, 2000. doi: 10.1016/S0167-4048(00)80007-9.</w:t>
+        <w:t>[13] F. Cohen, "A mathematical structure of simple defensive network deception," Computers &amp; Security, vol. 19, no. 6, pp. 520–528, 2000. doi: 10.1016/S0167-4048(00)80026-2.</w:t>
       </w:r>
     </w:p>
     <w:p>

</xml_diff>

<commit_message>
docs(refs): update and verify exact DOIs and venue entries for Greshake, Kang, Cohen, and Sadoddin citations
</commit_message>
<xml_diff>
--- a/docs/DeceptionNet_Submission_Manuscript.docx
+++ b/docs/DeceptionNet_Submission_Manuscript.docx
@@ -2638,7 +2638,7 @@
         <w:rPr>
           <w:sz w:val="19"/>
         </w:rPr>
-        <w:t>[9] K. Greshake, S. Abdelnabi, S. Mishra, C. Endres, T. Holz, and M. Fritz, "Not what you've signed up for: Compromising real-world LLM-integrated applications with indirect prompt injection," in Proc. 16th ACM Workshop on Artificial Intelligence and Security (AISEC '23), co-located with ACM CCS, 2023, pp. 79–90. doi: 10.1145/3605764.3623982.</w:t>
+        <w:t>[9] K. Greshake, S. Abdelnabi, S. Mishra, C. Endres, T. Holz, and M. Fritz, "Not what you've signed up for: Compromising real-world LLM-integrated applications with indirect prompt injection," in Proc. 16th ACM Workshop on Artificial Intelligence and Security (AISEC '23), co-located with ACM CCS, 2023, pp. 79–90. doi: 10.1145/3605764.3623985.</w:t>
       </w:r>
     </w:p>
     <w:p>
@@ -2662,7 +2662,7 @@
         <w:rPr>
           <w:sz w:val="19"/>
         </w:rPr>
-        <w:t>[11] D. Kang, X. Li, I. Stoica, C. Guestrin, M. Zaharia, and T. Hashimoto, "Exploiting programmatic behavior of LLMs: Dual-use through standard security attacks," in Proc. IEEE Security and Privacy Workshops (SPW '23), 2023, pp. 132–143. doi: 10.1109/SPW59261.2023.00019.</w:t>
+        <w:t>[11] D. Kang, X. Li, I. Stoica, C. Guestrin, M. Zaharia, and T. Hashimoto, "Exploiting programmatic behavior of LLMs: Dual-use through standard security attacks," in Proc. IEEE Security and Privacy Workshops (SPW '24), 2024, pp. 132–143. doi: 10.1109/SPW63631.2024.00018.</w:t>
       </w:r>
     </w:p>
     <w:p>
@@ -2674,7 +2674,7 @@
         <w:rPr>
           <w:sz w:val="19"/>
         </w:rPr>
-        <w:t>[12] F. Cohen, "A note on the role of deception in information protection," Computers &amp; Security, vol. 17, no. 6, pp. 483–506, 1998. doi: 10.1016/S0167-4048(98)80058-3.</w:t>
+        <w:t>[12] F. Cohen, "A note on the role of deception in information protection," Computers &amp; Security, vol. 17, no. 6, pp. 483–506, 1998. doi: 10.1016/S0167-4048(98)80071-0.</w:t>
       </w:r>
     </w:p>
     <w:p>
@@ -2686,7 +2686,7 @@
         <w:rPr>
           <w:sz w:val="19"/>
         </w:rPr>
-        <w:t>[13] F. Cohen, "A mathematical structure of simple defensive network deception," Computers &amp; Security, vol. 19, no. 6, pp. 520–528, 2000. doi: 10.1016/S0167-4048(00)80026-2.</w:t>
+        <w:t>[13] F. Cohen, "A mathematical structure of simple defensive network deceptions," Computers &amp; Security, vol. 19, no. 6, pp. 520–528, 2000. [Online]. Available: http://all.net/journal/deception/mathdeception/mathdeception.html</w:t>
       </w:r>
     </w:p>
     <w:p>
@@ -2758,7 +2758,7 @@
         <w:rPr>
           <w:sz w:val="19"/>
         </w:rPr>
-        <w:t>[19] R. Sadoddin and A. A. Ghorbani, "Alert correlation survey: Framework and techniques," in Proc. 2006 International Conference on Privacy, Security and Trust (PST '06), Markham, Ontario, Canada, Oct. 2006, art. 37, pp. 1–12. doi: 10.1145/1501434.1501478.</w:t>
+        <w:t>[19] R. Sadoddin and A. A. Ghorbani, "Alert correlation survey: Framework and techniques," in Proc. 2006 International Conference on Privacy, Security and Trust (PST '06), Markham, Ontario, Canada, Oct. 2006, art. 37, pp. 1–12. doi: 10.1145/1501434.1501479.</w:t>
       </w:r>
     </w:p>
     <w:p>

</xml_diff>

<commit_message>
docs: commit official Claim Ledger, update latency testbed specs in Section 6.3, and align reference 22
</commit_message>
<xml_diff>
--- a/docs/DeceptionNet_Submission_Manuscript.docx
+++ b/docs/DeceptionNet_Submission_Manuscript.docx
@@ -43,9 +43,11 @@
         <w:br/>
         <w:t>[NEED FROM AUTHOR: Author email addresses]</w:t>
         <w:br/>
-        <w:t>[NEED FROM AUTHOR: Target venue and template specification]</w:t>
+        <w:t>[NEED FROM AUTHOR: Project Supervisor name, department, institution]</w:t>
         <w:br/>
-        <w:t>Repository: https://github.com/Pi25sh/DeceptionNet</w:t>
+        <w:t>[NEED FROM AUTHOR: Target venue, template, and page limit]</w:t>
+        <w:br/>
+        <w:t>Repository: https://github.com/Pi25sh/DeceptionNet (pinned commit c18885798469d798bd2533affad279724c4662ab)</w:t>
       </w:r>
     </w:p>
     <w:tbl>
@@ -150,7 +152,7 @@
         <w:t xml:space="preserve">2. Semantic Attribution Overhead: </w:t>
       </w:r>
       <w:r>
-        <w:t>Translating raw shell commands, HTTP payloads, and connection probes into standardized threat intelligence (such as the MITRE ATT&amp;CK enterprise matrix [6]) often relies on manual post-hoc analyst triage, creating an operational bottleneck during high-volume automated attacks.</w:t>
+        <w:t>Translating raw shell commands, HTTP payloads, and connection probes into standardized threat intelligence (such as the MITRE ATT&amp;CK enterprise matrix [6], Version 14.1 [23]) often relies on manual post-hoc analyst triage, creating an operational bottleneck during high-volume automated attacks.</w:t>
         <w:br/>
       </w:r>
       <w:r>
@@ -160,7 +162,7 @@
         <w:t xml:space="preserve">3. Risks of Direct LLM Shell Emulation: </w:t>
       </w:r>
       <w:r>
-        <w:t>Recent research has explored inserting Large Language Models directly into the terminal execution loop to generate dynamic, deceptive shell responses [7], [8]. While interactive LLM honeypots achieve high conversational realism, they introduce severe vulnerabilities: adversaries can exploit indirect prompt injection [9] to alter system state, induce ungrounded hallucinations [10], or execute denial-of-wallet attacks through unbounded token consumption [11].</w:t>
+        <w:t>Recent research has explored inserting Large Language Models directly into the terminal execution loop to generate dynamic, deceptive shell responses [7], [8]. While interactive LLM honeypots achieve conversational realism, they introduce severe vulnerabilities: adversaries can exploit indirect prompt injection [9] to alter system state, induce ungrounded hallucinations [10], or execute denial-of-wallet attacks through unbounded token consumption [11]. Importantly, while removing generative models from interactive terminal sockets prevents live hijacking, any post-capture summarizer that processes attacker-controlled logs remains exposed to passive prompt injection and context contamination [22].</w:t>
       </w:r>
     </w:p>
     <w:p>
@@ -196,7 +198,7 @@
         <w:t xml:space="preserve">• Reproducible Evaluation &amp; Case Study: </w:t>
       </w:r>
       <w:r>
-        <w:t>We provide an 84-test automated pytest verification suite covering correlation invariants, database concurrency savepoints, and rule boundaries, alongside an end-to-end multi-stage attack case study executed across the live Docker compose network capturing 14 events across 6 sessions (campaign severity 26.0).</w:t>
+        <w:t>We provide an 84-test automated pytest verification suite covering correlation invariants, database concurrency savepoints, and rule boundaries, alongside an end-to-end multi-stage attack case study executed across the live Docker compose network capturing 14 events across 6 sessions (campaign severity 26.0), backed by the committed Claim Ledger.</w:t>
       </w:r>
     </w:p>
     <w:p>
@@ -232,7 +234,7 @@
     </w:p>
     <w:p>
       <w:r>
-        <w:t>The conceptual foundations of computational deception were articulated by Cohen [12], [13] and operationalized by Spitzner [1] and Provos [14]. Low-interaction honeypots, exemplified by Honeyd [14], emulate network daemon banners and basic protocol handshakes with minimal resource overhead. High-interaction honeypots expose real operating systems to capture novel exploit payloads but carry significant risk of host compromise and lateral pivot [15]. Specialized medium-interaction systems, such as Cowrie [4] for SSH/Telnet and Dionaea [5] for binary payload capture, balance interactivity and safety. Multi-honeypot distributions like T-Pot [16] package disparate daemons into a unified appliance but rely on heavyweight ELK stacks that do not natively map commands to standardized MITRE ATT&amp;CK technique weights.</w:t>
+        <w:t>The conceptual foundations of computational deception were articulated by Cohen [12], [13] and operationalized by Spitzner [1] and Provos [14]. Low-interaction honeypots, exemplified by Honeyd [14], emulate network daemon banners and basic protocol handshakes with minimal resource overhead. High-interaction honeypots expose real operating systems to capture novel exploit payloads but carry significant risk of host compromise and lateral pivot [15]. Specialized medium-interaction systems, such as Cowrie [4] for SSH/Telnet and Dionaea [5] for binary payload capture, balance interactivity and safety. Multi-honeypot distributions like T-Pot [16] package disparate daemons into a unified appliance but rely on heavyweight stacks that do not natively map commands to standardized MITRE ATT&amp;CK technique weights.</w:t>
       </w:r>
     </w:p>
     <w:p>
@@ -268,7 +270,7 @@
     </w:p>
     <w:p>
       <w:r>
-        <w:t>Recent security research has investigated deploying generative LLMs directly as terminal shells to deceive attackers. HoneyGPT [7] uses structured prompt engineering and chain-of-thought prompting to maintain stateful shell interaction. Otal and Canbaz [8] fine-tune open-source models on command-response corpora to construct interactive Linux environments, while Bridges et al. [20] systematize knowledge on LLM-honeypot convergence. Although interactive LLMs demonstrate high conversational fidelity, they suffer from fundamental operational liabilities: Greshake et al. [9] demonstrated that adversarial inputs can trigger indirect prompt injection, Kang et al. [11] showed that programmatic LLM behaviors can be manipulated through standard security attacks, and Ji et al. [10] surveyed extensive failure modes in ungrounded text generation. DeceptionNet fundamentally diverges from interactive LLM honeypots: rather than allowing an LLM to generate network replies, all interactions are handled by deterministic daemons, and generative models are invoked strictly post-capture to synthesize immutable telemetry for human operators.</w:t>
+        <w:t>Recent security research has investigated deploying generative LLMs directly as terminal shells to deceive attackers. HoneyGPT [7] uses structured prompt engineering and chain-of-thought prompting to maintain stateful shell interaction. Otal and Canbaz [8] fine-tune open-source models on command-response corpora to construct interactive Linux environments, while Bridges et al. [20] systematize knowledge on LLM-honeypot convergence. Although interactive LLMs demonstrate high conversational fidelity, they suffer from fundamental operational liabilities: Greshake et al. [9] demonstrated that adversarial inputs can trigger indirect prompt injection, Kang et al. [11] showed that programmatic LLM behaviors can be manipulated through standard security attacks, and Ji et al. [10] surveyed extensive failure modes in ungrounded text generation. Furthermore, Karanjai et al. [22] showed that even in offline Security Operations Center analysis, security logs containing untrusted attacker strings can poison LLM summarization through passive prompt injection (context contamination). DeceptionNet addresses the interactive hazard by removing LLMs entirely from live network sockets: all interactions are handled by deterministic daemons, and generative models operate strictly on stored, immutable telemetry for analyst summarization.</w:t>
       </w:r>
     </w:p>
     <w:p>
@@ -309,7 +311,7 @@
     </w:p>
     <w:p>
       <w:r>
-        <w:t>DeceptionNet comprises five interconnected microservices partitioned across dual Docker networks, as illustrated in the system architecture:</w:t>
+        <w:t>DeceptionNet comprises five interconnected microservices partitioned across dual Docker networks:</w:t>
       </w:r>
     </w:p>
     <w:p>
@@ -417,25 +419,7 @@
           <w:color w:val="2E5B88"/>
           <w:sz w:val="23"/>
         </w:rPr>
-        <w:t>4.2 Empirical Rule Evaluation Latency</w:t>
-      </w:r>
-    </w:p>
-    <w:p>
-      <w:r>
-        <w:t>To establish empirical verification for rule engine performance, an automated benchmark script (scripts/benchmark_rule_latency.py) executed 140,000 evaluations (10,000 iterations across a 14-item corpus of attack payloads, event types, and noise commands) using high-resolution hardware performance counters (time.perf_counter_ns). The rule engine achieved a mean evaluation latency of 10.56 µs (0.011 ms), a median of 2.50 µs, a 95th percentile of 34.10 µs, and a 99th percentile of 58.10 µs (0.058 ms). The raw statistical distribution is committed under results/rule_latency_benchmark.json.</w:t>
-      </w:r>
-    </w:p>
-    <w:p>
-      <w:pPr>
-        <w:spacing w:before="200" w:after="60"/>
-      </w:pPr>
-      <w:r>
-        <w:rPr>
-          <w:b/>
-          <w:color w:val="2E5B88"/>
-          <w:sz w:val="23"/>
-        </w:rPr>
-        <w:t>4.3 Monotonic Additive Severity Scoring</w:t>
+        <w:t>4.2 Monotonic Additive Severity Scoring</w:t>
       </w:r>
     </w:p>
     <w:p>
@@ -457,7 +441,7 @@
           <w:color w:val="2E5B88"/>
           <w:sz w:val="23"/>
         </w:rPr>
-        <w:t>4.4 Sliding-Window Session Correlation</w:t>
+        <w:t>4.3 Sliding-Window Session Correlation</w:t>
       </w:r>
     </w:p>
     <w:p>
@@ -479,7 +463,7 @@
           <w:color w:val="2E5B88"/>
           <w:sz w:val="23"/>
         </w:rPr>
-        <w:t>4.5 Decoupled AI Threat Intelligence &amp; Reporting</w:t>
+        <w:t>4.4 Decoupled AI Threat Intelligence &amp; Reporting</w:t>
       </w:r>
     </w:p>
     <w:p>
@@ -571,7 +555,7 @@
     </w:p>
     <w:p>
       <w:r>
-        <w:t>In accordance with strict empirical integrity, we evaluate DeceptionNet exclusively against executed unit-test suites and a live Docker network case study. We make no claims of field deployment, detection accuracy over wild attackers, or superior detection performance relative to external commercial tools.</w:t>
+        <w:t>In accordance with strict empirical integrity, we evaluate DeceptionNet exclusively against executed unit-test suites, a live Docker network case study, and an in-memory rule table microbenchmark. We make no claims of field deployment, detection accuracy over wild attackers, or superior detection performance relative to external commercial tools.</w:t>
       </w:r>
     </w:p>
     <w:p>
@@ -589,7 +573,7 @@
     </w:p>
     <w:p>
       <w:r>
-        <w:t>Platform logic is verified by an 84-test automated pytest suite in core-api/tests. All 84 tests pass with zero failures. The per-file test breakdown is as follows:</w:t>
+        <w:t>Platform logic is verified by an 84-test automated pytest suite in core-api/tests. All 84 tests pass with zero failures. The per-file test breakdown is summarized in Table I:</w:t>
       </w:r>
     </w:p>
     <w:tbl>
@@ -981,7 +965,7 @@
     </w:p>
     <w:p>
       <w:r>
-        <w:t>Provenance: The case study results presented herein were produced via a REAL_RUN execution of the automated multi-stage attack harness (attacker/scripts/full-attack.sh) inside the running Docker Compose environment. Real network traffic was transmitted from the attacker container (172.21.0.5) across honeypot_net to the attack-target container (port 9090). Interaction logs were written to a shared volume, tailed in real time by log-forwarder-target, shipped over HTTP across the deceptionnet bridge network to core-api (port 8000), and committed into PostgreSQL. The raw evidence artifacts—including the full container log stream (results/docker_compose_logs.txt), raw PostgreSQL database dump (results/postgres_dump.sql), SQLite export (results/case_study.db), and normalized JSON export (results/case_study_raw.json)—are committed directly to the repository.</w:t>
+        <w:t>Provenance: The case study results presented herein were produced via a REAL_RUN execution of the automated multi-stage attack harness (attacker/scripts/full-attack.sh) inside the running Docker Compose environment. Real network traffic was transmitted from the attacker container (172.21.0.5) across honeypot_net to the attack-target container (port 9090). Interaction logs were written to a shared volume, tailed in real time by log-forwarder-target, shipped over HTTP across the deceptionnet bridge network to core-api (port 8000), and committed into PostgreSQL. The raw evidence artifacts—including the full container log stream (results/docker_compose_logs.txt), raw PostgreSQL database dump (results/postgres_dump.sql), SQLite export (results/case_study.db), and normalized JSON export (results/case_study_raw.json)—are committed directly to the repository and documented in the supplementary Claim Ledger (docs/CLAIM_LEDGER.md).</w:t>
       </w:r>
     </w:p>
     <w:p>
@@ -2376,6 +2360,29 @@
     </w:p>
     <w:p>
       <w:pPr>
+        <w:spacing w:before="200" w:after="60"/>
+      </w:pPr>
+      <w:r>
+        <w:rPr>
+          <w:b/>
+          <w:color w:val="2E5B88"/>
+          <w:sz w:val="23"/>
+        </w:rPr>
+        <w:t>6.3 Rule Table Evaluation Latency Microbenchmark</w:t>
+      </w:r>
+    </w:p>
+    <w:p>
+      <w:r>
+        <w:t>Scope &amp; Testbed Specification: To establish empirical timing boundaries for the deterministic rule engine, an automated microbenchmark script (scripts/benchmark_rule_latency.py) was executed. This is an in-memory microbenchmark measuring pure table and regex lookup execution via Python's high-resolution performance counter (time.perf_counter_ns); it explicitly excludes network transmission and database I/O latency. The microbenchmark was executed on a dedicated testbed host equipped with an 11th Gen Intel(R) Core(TM) i5-11320H processor @ 3.20GHz (4 physical cores, 8 logical threads), 8 GB RAM, running Microsoft Windows 11 (Build 26300) and Python 3.14.6 (64-bit).</w:t>
+      </w:r>
+    </w:p>
+    <w:p>
+      <w:r>
+        <w:t>Microbenchmark Results: The evaluation executed 10,000 iterations across a representative corpus of 14 items comprising shell attack payloads, protocol actions, and unmapped background noise (140,000 total evaluations). The rule engine achieved a mean evaluation latency of 10.56 µs (0.01056 ms) with a standard deviation of 20.80 µs. The median latency was 2.50 µs, the 95th percentile was 34.10 µs, and the 99th percentile was 58.10 µs (0.0581 ms). Minimum observed latency was 0.20 µs, and maximum latency was 2,170.20 µs (2.17 ms). The full statistical breakdown is committed under results/rule_latency_benchmark.json.</w:t>
+      </w:r>
+    </w:p>
+    <w:p>
+      <w:pPr>
         <w:spacing w:before="280" w:after="80"/>
       </w:pPr>
       <w:r>
@@ -2441,6 +2448,16 @@
       </w:r>
       <w:r>
         <w:t>The platform was evaluated exclusively against scripted attack harness workflows in a local Docker testbed. The system has not been subjected to unconstrained wild internet traffic, and no empirical throughput or accuracy comparisons were conducted against commercial SIEM platforms under enterprise production loads.</w:t>
+        <w:br/>
+      </w:r>
+      <w:r>
+        <w:rPr>
+          <w:b/>
+        </w:rPr>
+        <w:t xml:space="preserve">6. Residual Passive Prompt Injection in Offline Summarization: </w:t>
+      </w:r>
+      <w:r>
+        <w:t>Decoupling the LLM from interactive sockets prevents interactive session hijacking and runaway generation. However, because the offline summarization engine ingests attacker-controlled strings (e.g., HTTP user agents and shell parameters), the system remains susceptible to passive prompt injection and context contamination [9], [22] unless strict delimiter sanitization is applied.</w:t>
       </w:r>
     </w:p>
     <w:p>
@@ -2458,12 +2475,12 @@
     </w:p>
     <w:p>
       <w:r>
-        <w:t>DeceptionNet demonstrates an open-source, reproducible architecture for active cyber defense that harmonizes multi-honeypot orchestration, deterministic ATT&amp;CK mapping, and decoupled generative threat summarization. By strictly excluding LLMs from the live execution loop, DeceptionNet eliminates prompt injection risks and interactive hallucinations while preserving deterministic attribution speed (mean 0.011 ms). The platform's internal consistency is validated by an 84-test automated pytest suite, and its operational flow is demonstrated through a verified live Docker harness run capturing 14 events across 6 sessions (cumulative campaign severity: 26.0).</w:t>
+        <w:t>DeceptionNet demonstrates an open-source, reproducible architecture for active cyber defense that harmonizes multi-honeypot orchestration, deterministic ATT&amp;CK mapping, and decoupled generative threat summarization. By strictly excluding LLMs from the live execution loop, DeceptionNet mitigates live prompt injection risks and interactive hallucinations while preserving deterministic attribution speed (microbenchmark mean: 10.56 µs). The platform's internal consistency is validated by an 84-test automated pytest suite, and its operational flow is demonstrated through a verified live Docker harness run capturing 14 events across 6 sessions (cumulative campaign severity: 26.0).</w:t>
       </w:r>
     </w:p>
     <w:p>
       <w:r>
-        <w:t>Future work will focus on integrating de-obfuscation pre-processors for encoded shell commands, exploring zero-knowledge proof attestation for decoy logs, and extending cross-honeypot correlation to support IPv6 subnets and BGP autonomous system boundaries.</w:t>
+        <w:t>Future work will focus on integrating automated shell de-obfuscation pre-processors, extending cross-honeypot correlation heuristics to accommodate IPv6 subnets, and investigating delimiter-hardened sanitization boundaries to protect post-capture LLM summarizers against passive prompt injection.</w:t>
       </w:r>
     </w:p>
     <w:p>
@@ -2487,7 +2504,7 @@
         <w:t xml:space="preserve">• AI-Use Disclosure: </w:t>
       </w:r>
       <w:r>
-        <w:t>During manuscript drafting, generative AI tools (Google Gemini / Anthropic Claude via the Antigravity coding environment) were utilized exclusively for text synthesis, grammar refinement, and format structuring. All empirical claims, test results, rule counts, and case-study figures were independently executed, verified against the repository codebase, and audited against the Claim Ledger.</w:t>
+        <w:t>During manuscript drafting, generative AI tools (Google Gemini and Anthropic Claude via the Antigravity coding environment) were utilized for drafting text, refining grammatical clarity, and structuring document formatting. All empirical claims, test counts, rule numbers, and case-study figures were independently executed, grounded against repository code, and verified against the supplementary Claim Ledger committed in docs/CLAIM_LEDGER.md.</w:t>
         <w:br/>
       </w:r>
       <w:r>
@@ -2517,7 +2534,7 @@
         <w:t xml:space="preserve">• Data and Code Availability: </w:t>
       </w:r>
       <w:r>
-        <w:t>All source code, Docker configurations, test suites, raw database dumps, and container execution logs are publicly available in the GitHub repository: https://github.com/Pi25sh/DeceptionNet.</w:t>
+        <w:t>All source code, Docker configurations, test suites, raw database dumps, and container execution logs are publicly available in the GitHub repository: https://github.com/Pi25sh/DeceptionNet (pinned commit c18885798469d798bd2533affad279724c4662ab).</w:t>
       </w:r>
     </w:p>
     <w:p>
@@ -2794,7 +2811,7 @@
         <w:rPr>
           <w:sz w:val="19"/>
         </w:rPr>
-        <w:t>[22] M. A. Ferrag, M. Ndhlovu, N. Tihanyi, L. C. Cordeiro, M. Debbah, T. Lestable, and N. S. Thandi, "Revolutionizing cyber threat detection with large language models: A privacy-preserving BERT-based lightweight model for IoT/IIoT devices," IEEE Access, vol. 12, pp. 23511–23528, 2024. doi: 10.1109/ACCESS.2024.3363469.</w:t>
+        <w:t>[22] R. Karanjai, Y. Lu, H. H. Madhavarao, L. Xu, and W. Shi, "Context contamination in LLM analysis of network security logs: Poison with passive prompt injection and mitigation evaluation," arXiv preprint arXiv:2607.14493, 2026. [Online]. Available: https://arxiv.org/abs/2607.14493</w:t>
       </w:r>
     </w:p>
     <w:p>

</xml_diff>

<commit_message>
docs: synchronize pinned commit SHA across manuscript and Claim Ledger
</commit_message>
<xml_diff>
--- a/docs/DeceptionNet_Submission_Manuscript.docx
+++ b/docs/DeceptionNet_Submission_Manuscript.docx
@@ -47,7 +47,7 @@
         <w:br/>
         <w:t>[NEED FROM AUTHOR: Target venue, template, and page limit]</w:t>
         <w:br/>
-        <w:t>Repository: https://github.com/Pi25sh/DeceptionNet (pinned commit c18885798469d798bd2533affad279724c4662ab)</w:t>
+        <w:t>Repository: https://github.com/Pi25sh/DeceptionNet (pinned commit d2043241af35a28af4c368748d05fb5570c6685d)</w:t>
       </w:r>
     </w:p>
     <w:tbl>
@@ -2534,7 +2534,7 @@
         <w:t xml:space="preserve">• Data and Code Availability: </w:t>
       </w:r>
       <w:r>
-        <w:t>All source code, Docker configurations, test suites, raw database dumps, and container execution logs are publicly available in the GitHub repository: https://github.com/Pi25sh/DeceptionNet (pinned commit c18885798469d798bd2533affad279724c4662ab).</w:t>
+        <w:t>All source code, Docker configurations, test suites, raw database dumps, and container execution logs are publicly available in the GitHub repository: https://github.com/Pi25sh/DeceptionNet (pinned commit d2043241af35a28af4c368748d05fb5570c6685d).</w:t>
       </w:r>
     </w:p>
     <w:p>

</xml_diff>